<commit_message>
refactor: integrate your own word to pdf conversion service
</commit_message>
<xml_diff>
--- a/resources/templates/certificado_convenio_cuenta_bancolombia_template.docx
+++ b/resources/templates/certificado_convenio_cuenta_bancolombia_template.docx
@@ -162,7 +162,7 @@
           <w:szCs w:val="28"/>
           <w:lang w:val="es-419" w:eastAsia="es-419"/>
         </w:rPr>
-        <w:pict w14:anchorId="0219F49D">
+        <w:pict w14:anchorId="210EF3E1">
           <v:shapetype id="_x0000_t201" coordsize="21600,21600" o:spt="201" path="m,l,21600r21600,l21600,xe">
             <v:stroke joinstyle="miter"/>
             <v:path shadowok="f" o:extrusionok="f" strokeok="f" fillok="f" o:connecttype="rect"/>
@@ -822,12 +822,12 @@
     </w:p>
     <w:p>
       <w:pPr>
-        <w:jc w:val="both"/>
+        <w:spacing w:after="160" w:line="259" w:lineRule="auto"/>
         <w:rPr>
           <w:rFonts w:ascii="Arial" w:hAnsi="Arial" w:cs="Arial"/>
           <w:color w:val="000000"/>
-          <w:sz w:val="21"/>
-          <w:szCs w:val="21"/>
+          <w:sz w:val="24"/>
+          <w:szCs w:val="24"/>
           <w:lang w:val="es-MX"/>
         </w:rPr>
       </w:pPr>
@@ -1810,7 +1810,7 @@
         <v:path o:extrusionok="f" gradientshapeok="t" o:connecttype="rect"/>
         <o:lock v:ext="edit" aspectratio="t"/>
       </v:shapetype>
-      <v:shape id="_x0000_i1025" type="#_x0000_t75" style="width:10.9pt;height:10.9pt" o:bullet="t">
+      <v:shape id="_x0000_i1025" type="#_x0000_t75" style="width:10.85pt;height:10.85pt" o:bullet="t">
         <v:imagedata r:id="rId1" o:title="mso2379"/>
       </v:shape>
     </w:pict>

</xml_diff>